<commit_message>
feat: Implement initial data ingestion, feature engineering, and transfer learning pipeline with new datasets, models, tests, and documentation.
</commit_message>
<xml_diff>
--- a/AI_Narrative_Earnings_Calls_Proposal.docx
+++ b/AI_Narrative_Earnings_Calls_Proposal.docx
@@ -22,7 +22,73 @@
         <w:rPr>
           <w:i/>
         </w:rPr>
-        <w:t>Working draft for group review</w:t>
+        <w:t>Group Member:</w:t>
+      </w:r>
+      <w:r>
+        <w:rPr>
+          <w:i/>
+        </w:rPr>
+        <w:t xml:space="preserve"> </w:t>
+      </w:r>
+      <w:r>
+        <w:rPr>
+          <w:i/>
+        </w:rPr>
+        <w:t xml:space="preserve">Arthur </w:t>
+      </w:r>
+      <w:proofErr w:type="spellStart"/>
+      <w:r>
+        <w:rPr>
+          <w:i/>
+        </w:rPr>
+        <w:t>Hsu,</w:t>
+      </w:r>
+      <w:proofErr w:type="spellEnd"/>
+      <w:r>
+        <w:rPr>
+          <w:i/>
+        </w:rPr>
+        <w:t xml:space="preserve"> Deng Pan, </w:t>
+      </w:r>
+      <w:proofErr w:type="spellStart"/>
+      <w:r>
+        <w:rPr>
+          <w:i/>
+        </w:rPr>
+        <w:t>Weijie</w:t>
+      </w:r>
+      <w:proofErr w:type="spellEnd"/>
+      <w:r>
+        <w:rPr>
+          <w:i/>
+        </w:rPr>
+        <w:t xml:space="preserve"> Huang, </w:t>
+      </w:r>
+      <w:proofErr w:type="spellStart"/>
+      <w:r>
+        <w:rPr>
+          <w:i/>
+        </w:rPr>
+        <w:t>Ruohan</w:t>
+      </w:r>
+      <w:proofErr w:type="spellEnd"/>
+      <w:r>
+        <w:rPr>
+          <w:i/>
+        </w:rPr>
+        <w:t xml:space="preserve"> Zhong</w:t>
+      </w:r>
+      <w:r>
+        <w:rPr>
+          <w:i/>
+        </w:rPr>
+        <w:t xml:space="preserve">, </w:t>
+      </w:r>
+      <w:r>
+        <w:rPr>
+          <w:i/>
+        </w:rPr>
+        <w:t>Yichen Hu</w:t>
       </w:r>
     </w:p>
     <w:p>
@@ -32,8 +98,13 @@
         </w:rPr>
         <w:t xml:space="preserve">Dataset: </w:t>
       </w:r>
-      <w:r>
-        <w:t>glopardo/sp500-earnings-transcripts (Hugging Face)</w:t>
+      <w:proofErr w:type="spellStart"/>
+      <w:r>
+        <w:t>glopardo</w:t>
+      </w:r>
+      <w:proofErr w:type="spellEnd"/>
+      <w:r>
+        <w:t>/sp500-earnings-transcripts (Hugging Face)</w:t>
       </w:r>
     </w:p>
     <w:p>
@@ -66,7 +137,53 @@
     </w:p>
     <w:p>
       <w:r>
-        <w:t>AI has become a dominant market narrative, but it is unclear whether markets are pricing real fundamental improvements or narrative intensity. Earnings calls are a key channel where management explains results and future plans. This project quantifies “AI narratives” in earnings-call transcripts and tests whether they are associated with, and can help predict, changes in market expectations and valuation proxies.</w:t>
+        <w:t xml:space="preserve">AI has become a dominant market narrative, but it is unclear whether markets are pricing real fundamental improvements or narrative intensity. Earnings calls are a </w:t>
+      </w:r>
+      <w:proofErr w:type="gramStart"/>
+      <w:r>
+        <w:t xml:space="preserve">key </w:t>
+      </w:r>
+      <w:r>
+        <w:t>way</w:t>
+      </w:r>
+      <w:proofErr w:type="gramEnd"/>
+      <w:r>
+        <w:t xml:space="preserve"> where management explains </w:t>
+      </w:r>
+      <w:r>
+        <w:t>operating performance</w:t>
+      </w:r>
+      <w:r>
+        <w:t xml:space="preserve"> and </w:t>
+      </w:r>
+      <w:proofErr w:type="gramStart"/>
+      <w:r>
+        <w:t>future plans</w:t>
+      </w:r>
+      <w:proofErr w:type="gramEnd"/>
+      <w:r>
+        <w:t xml:space="preserve">. </w:t>
+      </w:r>
+      <w:r>
+        <w:t>We aim to</w:t>
+      </w:r>
+      <w:r>
+        <w:t xml:space="preserve"> quantifies AI</w:t>
+      </w:r>
+      <w:r>
+        <w:t>-related</w:t>
+      </w:r>
+      <w:r>
+        <w:t xml:space="preserve"> narratives in earningscall transcripts and tests whether they are associated with</w:t>
+      </w:r>
+      <w:r>
+        <w:t xml:space="preserve"> </w:t>
+      </w:r>
+      <w:r>
+        <w:t>changes in market expectations</w:t>
+      </w:r>
+      <w:r>
+        <w:t>, and if they can help predict valuation.</w:t>
       </w:r>
     </w:p>
     <w:p>
@@ -79,7 +196,13 @@
     </w:p>
     <w:p>
       <w:r>
-        <w:t>RQ1 (Descriptive): How does AI narrative intensity diffuse over time and across sectors/industries?</w:t>
+        <w:t>RQ1 (Descriptive): How does AI narrative intensity diffuse over time and across sectors</w:t>
+      </w:r>
+      <w:r>
+        <w:t xml:space="preserve"> / </w:t>
+      </w:r>
+      <w:r>
+        <w:t>industries?</w:t>
       </w:r>
     </w:p>
     <w:p>
@@ -92,7 +215,25 @@
     </w:p>
     <w:p>
       <w:r>
-        <w:t>RQ2 (Explanatory): Is stronger AI narrative associated with higher (or improving) forward-looking valuation/expectations?</w:t>
+        <w:t xml:space="preserve">RQ2 (Explanatory): Is stronger AI narrative </w:t>
+      </w:r>
+      <w:r>
+        <w:t>related to</w:t>
+      </w:r>
+      <w:r>
+        <w:t xml:space="preserve"> higher forward-looking valuation</w:t>
+      </w:r>
+      <w:r>
+        <w:t xml:space="preserve"> </w:t>
+      </w:r>
+      <w:r>
+        <w:t>expectations</w:t>
+      </w:r>
+      <w:r>
+        <w:t>, or (or improving that</w:t>
+      </w:r>
+      <w:r>
+        <w:t>?</w:t>
       </w:r>
     </w:p>
     <w:p>
@@ -100,12 +241,55 @@
         <w:pStyle w:val="ListBullet"/>
       </w:pPr>
       <w:r>
-        <w:t>H2: After controlling for sector/time effects and lagged fundamentals, higher AI narrative intensity is associated with higher forward P/E (or higher forward EPS) and/or larger quarter-over-quarter improvements.</w:t>
+        <w:t>H2: After controlling for sector</w:t>
+      </w:r>
+      <w:r>
+        <w:t xml:space="preserve">, </w:t>
+      </w:r>
+      <w:proofErr w:type="spellStart"/>
+      <w:proofErr w:type="gramStart"/>
+      <w:r>
+        <w:t>time</w:t>
+      </w:r>
+      <w:r>
+        <w:t>,etc</w:t>
+      </w:r>
+      <w:proofErr w:type="spellEnd"/>
+      <w:r>
+        <w:t>.</w:t>
+      </w:r>
+      <w:proofErr w:type="gramEnd"/>
+      <w:r>
+        <w:t xml:space="preserve"> effects and lagged fundamentals, higher AI narrative intensity is </w:t>
+      </w:r>
+      <w:r>
+        <w:t>related to</w:t>
+      </w:r>
+      <w:r>
+        <w:t xml:space="preserve"> higher forward P/E </w:t>
+      </w:r>
+      <w:r>
+        <w:t xml:space="preserve">or EPS, </w:t>
+      </w:r>
+      <w:r>
+        <w:t xml:space="preserve">and larger </w:t>
+      </w:r>
+      <w:r>
+        <w:t>QoQ</w:t>
+      </w:r>
+      <w:r>
+        <w:t xml:space="preserve"> improvements.</w:t>
       </w:r>
     </w:p>
     <w:p>
       <w:r>
-        <w:t>RQ3 (Predictive): Does adding text-derived AI features improve prediction of next-quarter changes in expectations/valuation?</w:t>
+        <w:t>RQ3 (Predictive): Does adding text-derived AI features improve prediction of next</w:t>
+      </w:r>
+      <w:r>
+        <w:t xml:space="preserve"> </w:t>
+      </w:r>
+      <w:r>
+        <w:t>quarter changes in valuation?</w:t>
       </w:r>
     </w:p>
     <w:p>
@@ -113,7 +297,21 @@
         <w:pStyle w:val="ListBullet"/>
       </w:pPr>
       <w:r>
-        <w:t>H3: Models that include AI narrative features outperform metadata-only baselines (with clear benchmark comparisons) under time-based validation.</w:t>
+        <w:t xml:space="preserve">H3: Models that include AI narrative features outperform </w:t>
+      </w:r>
+      <w:proofErr w:type="gramStart"/>
+      <w:r>
+        <w:t>those dataset</w:t>
+      </w:r>
+      <w:proofErr w:type="gramEnd"/>
+      <w:r>
+        <w:t xml:space="preserve"> only with </w:t>
+      </w:r>
+      <w:r>
+        <w:t>metadata (with clear benchmark comparisons)</w:t>
+      </w:r>
+      <w:r>
+        <w:t>.</w:t>
       </w:r>
     </w:p>
     <w:p>
@@ -132,12 +330,45 @@
         <w:t xml:space="preserve">Primary dataset: </w:t>
       </w:r>
       <w:r>
-        <w:t>S&amp;P 500 earnings-call transcripts with firm-level metadata and valuation/expectation proxies (2013Q2–2025Q1).</w:t>
+        <w:t>S&amp;P 500 earnings</w:t>
+      </w:r>
+      <w:r>
+        <w:t xml:space="preserve"> </w:t>
+      </w:r>
+      <w:r>
+        <w:t xml:space="preserve">call transcripts with </w:t>
+      </w:r>
+      <w:r>
+        <w:t xml:space="preserve">each firm’s </w:t>
+      </w:r>
+      <w:r>
+        <w:t>metadata and valuation/expectation proxies (</w:t>
+      </w:r>
+      <w:proofErr w:type="gramStart"/>
+      <w:r>
+        <w:t>time period</w:t>
+      </w:r>
+      <w:proofErr w:type="gramEnd"/>
+      <w:r>
+        <w:t xml:space="preserve">: </w:t>
+      </w:r>
+      <w:r>
+        <w:t>201</w:t>
+      </w:r>
+      <w:r>
+        <w:t>8</w:t>
+      </w:r>
+      <w:r>
+        <w:t>Q2–2025Q1).</w:t>
       </w:r>
     </w:p>
     <w:p>
       <w:r>
-        <w:t>Key fields (examples):</w:t>
+        <w:rPr>
+          <w:b/>
+          <w:bCs/>
+        </w:rPr>
+        <w:t>Dataset Statistics:</w:t>
       </w:r>
     </w:p>
     <w:p>
@@ -145,6 +376,109 @@
         <w:pStyle w:val="ListBullet"/>
       </w:pPr>
       <w:r>
+        <w:t>Number of documents: 12,774 firm-quarter transcripts</w:t>
+      </w:r>
+    </w:p>
+    <w:p>
+      <w:pPr>
+        <w:pStyle w:val="ListBullet"/>
+      </w:pPr>
+      <w:r>
+        <w:t>Time span: 2018 Q1 – 2024 Q4 (28 quarters)</w:t>
+      </w:r>
+    </w:p>
+    <w:p>
+      <w:pPr>
+        <w:pStyle w:val="ListBullet"/>
+      </w:pPr>
+      <w:r>
+        <w:t>Unique firms: 494 S&amp;P 500 companies across 11 sectors</w:t>
+      </w:r>
+    </w:p>
+    <w:p>
+      <w:pPr>
+        <w:pStyle w:val="ListBullet"/>
+      </w:pPr>
+      <w:r>
+        <w:t>Average document length: ~9,177 tokens (~52,800 characters)</w:t>
+      </w:r>
+    </w:p>
+    <w:p>
+      <w:pPr>
+        <w:pStyle w:val="ListBullet"/>
+      </w:pPr>
+      <w:r>
+        <w:t>Document length range: 769 – 43,339 tokens</w:t>
+      </w:r>
+    </w:p>
+    <w:p>
+      <w:r>
+        <w:rPr>
+          <w:b/>
+          <w:bCs/>
+        </w:rPr>
+        <w:t>Data Acquisition:</w:t>
+      </w:r>
+      <w:r>
+        <w:t xml:space="preserve"> The dataset is obtained programmatically using the Hugging Face </w:t>
+      </w:r>
+      <w:r>
+        <w:rPr>
+          <w:rFonts w:ascii="Courier New" w:hAnsi="Courier New"/>
+        </w:rPr>
+        <w:t>datasets</w:t>
+      </w:r>
+      <w:r>
+        <w:t xml:space="preserve"> library:</w:t>
+      </w:r>
+    </w:p>
+    <w:p>
+      <w:pPr>
+        <w:ind w:left="720"/>
+        <w:rPr>
+          <w:rFonts w:ascii="Courier New" w:hAnsi="Courier New"/>
+        </w:rPr>
+      </w:pPr>
+      <w:r>
+        <w:rPr>
+          <w:rFonts w:ascii="Courier New" w:hAnsi="Courier New"/>
+          <w:sz w:val="20"/>
+        </w:rPr>
+        <w:t>dataset = load_dataset("glopardo/sp500-earnings-transcripts")</w:t>
+      </w:r>
+    </w:p>
+    <w:p>
+      <w:r>
+        <w:rPr>
+          <w:b/>
+          <w:bCs/>
+        </w:rPr>
+        <w:t>Current Progress:</w:t>
+      </w:r>
+      <w:r>
+        <w:t xml:space="preserve"> We have downloaded the dataset from Hugging Face and loaded it into our Python environment for initial exploration. We are currently examining the data structure, checking for missing values, and understanding the distribution of key variables across sectors and time periods.</w:t>
+      </w:r>
+    </w:p>
+    <w:p>
+      <w:pPr>
+        <w:rPr>
+          <w:b/>
+          <w:bCs/>
+        </w:rPr>
+      </w:pPr>
+      <w:r>
+        <w:rPr>
+          <w:b/>
+          <w:bCs/>
+        </w:rPr>
+        <w:t>Key fields (examples):</w:t>
+      </w:r>
+    </w:p>
+    <w:p>
+      <w:pPr>
+        <w:pStyle w:val="ListBullet"/>
+      </w:pPr>
+      <w:r>
         <w:lastRenderedPageBreak/>
         <w:t>Identifiers: ticker, company, cik</w:t>
       </w:r>
@@ -182,42 +516,75 @@
       </w:r>
     </w:p>
     <w:p>
-      <w:pPr>
-        <w:pStyle w:val="Heading1"/>
-      </w:pPr>
-      <w:r>
-        <w:t>4. Variable Construction</w:t>
+      <w:r>
+        <w:rPr>
+          <w:b/>
+          <w:bCs/>
+        </w:rPr>
+        <w:t>Population:</w:t>
+      </w:r>
+      <w:r>
+        <w:t xml:space="preserve"> S&amp;P 500 constituent firms, representing large-cap U.S. equities. This sample provides high data quality (mandatory SEC filings, consistent reporting standards), broad sector coverage across the U.S. economy, and sufficient variation in AI adoption and discussion intensity.</w:t>
       </w:r>
     </w:p>
     <w:p>
-      <w:pPr>
-        <w:pStyle w:val="Heading2"/>
-      </w:pPr>
-      <w:r>
-        <w:t>4.1 Outcomes (Targets)</w:t>
+      <w:r>
+        <w:rPr>
+          <w:b/>
+          <w:bCs/>
+        </w:rPr>
+        <w:t>Outcomes of Interest:</w:t>
       </w:r>
     </w:p>
     <w:p>
-      <w:r>
-        <w:t>We will define at least one regression target and one classification target for robustness:</w:t>
+      <w:pPr>
+        <w:pStyle w:val="ListBullet"/>
+      </w:pPr>
+      <w:r>
+        <w:rPr>
+          <w:b/>
+        </w:rPr>
+        <w:t>Target A (Regression):</w:t>
+      </w:r>
+      <w:r>
+        <w:t xml:space="preserve"> Next-quarter change in forward P/E ratio: ΔForward P/E = peforw_qavg(t+1) − peforw_qavg(t)</w:t>
       </w:r>
     </w:p>
     <w:p>
-      <w:r>
-        <w:t>Target A (Regression): Next-quarter change in forward valuation proxy</w:t>
+      <w:pPr>
+        <w:pStyle w:val="ListBullet"/>
+      </w:pPr>
+      <w:r>
+        <w:rPr>
+          <w:b/>
+        </w:rPr>
+        <w:t>Target B (Classification):</w:t>
+      </w:r>
+      <w:r>
+        <w:t xml:space="preserve"> Valuation upgrade indicator: 1 if ΔForward P/E is in the top 25% within the same sector and quarter; else 0</w:t>
       </w:r>
     </w:p>
     <w:p>
-      <w:pPr>
-        <w:pStyle w:val="ListBullet"/>
-      </w:pPr>
-      <w:r>
-        <w:t>Example: ΔForward P/E = peforw_qavg(t+1) − peforw_qavg(t)</w:t>
+      <w:r>
+        <w:rPr>
+          <w:b/>
+          <w:bCs/>
+        </w:rPr>
+        <w:t>Control Variables:</w:t>
       </w:r>
     </w:p>
     <w:p>
-      <w:r>
-        <w:t>Target B (Classification): Valuation upgrade indicator</w:t>
+      <w:pPr>
+        <w:pStyle w:val="ListBullet"/>
+      </w:pPr>
+      <w:r>
+        <w:rPr>
+          <w:b/>
+        </w:rPr>
+        <w:t>Document controls:</w:t>
+      </w:r>
+      <w:r>
+        <w:t xml:space="preserve"> Token count, character count (all intensity measures normalised by document length)</w:t>
       </w:r>
     </w:p>
     <w:p>
@@ -225,60 +592,66 @@
         <w:pStyle w:val="ListBullet"/>
       </w:pPr>
       <w:r>
-        <w:t>Example: 1 if ΔForward P/E is in the top 25% within the same sector and quarter; else 0</w:t>
+        <w:rPr>
+          <w:b/>
+        </w:rPr>
+        <w:t>Lagged fundamentals:</w:t>
+      </w:r>
+      <w:r>
+        <w:t xml:space="preserve"> Prior-quarter forward P/E, trailing EPS (controls for baseline valuation levels)</w:t>
       </w:r>
     </w:p>
     <w:p>
       <w:pPr>
-        <w:pStyle w:val="Heading2"/>
-      </w:pPr>
-      <w:r>
-        <w:t>4.2 AI Narrative Features (Main Explanatory Variables)</w:t>
+        <w:pStyle w:val="ListBullet"/>
+      </w:pPr>
+      <w:r>
+        <w:rPr>
+          <w:b/>
+        </w:rPr>
+        <w:t>Fixed effects:</w:t>
+      </w:r>
+      <w:r>
+        <w:t xml:space="preserve"> Sector dummies, year-quarter dummies (absorbs sector-specific and time-specific heterogeneity)</w:t>
       </w:r>
     </w:p>
     <w:p>
-      <w:r>
-        <w:t>We define an AI Narrative Index (ANI) as a multi-component measure to avoid relying on keywords only:</w:t>
+      <w:pPr>
+        <w:pStyle w:val="Heading1"/>
+      </w:pPr>
+      <w:r>
+        <w:t>4. Variable Construction</w:t>
       </w:r>
     </w:p>
     <w:p>
       <w:pPr>
-        <w:pStyle w:val="ListBullet"/>
-      </w:pPr>
-      <w:r>
-        <w:t>Dictionary/keyword intensity: frequency of AI/LLM/GenAI-related terms, normalized by document length.</w:t>
+        <w:pStyle w:val="Heading2"/>
+      </w:pPr>
+      <w:r>
+        <w:t>4.1 Outcomes (Targets)</w:t>
       </w:r>
     </w:p>
     <w:p>
-      <w:pPr>
-        <w:pStyle w:val="ListBullet"/>
-      </w:pPr>
-      <w:r>
-        <w:t>Topic-based AI share: topic modeling (LDA or BERTopic) to estimate the proportion of AI-related topics in each transcript.</w:t>
+      <w:r>
+        <w:t>We will define at least one regression target and one classification target:</w:t>
       </w:r>
     </w:p>
     <w:p>
-      <w:pPr>
-        <w:pStyle w:val="ListBullet"/>
-      </w:pPr>
-      <w:r>
-        <w:t>Semantic similarity: embeddings-based similarity to a small set of AI seed phrases (captures AI discussion even without explicit keywords).</w:t>
+      <w:r>
+        <w:t>Target A (Regression): Next-quarter change in forward valuation proxy</w:t>
       </w:r>
     </w:p>
     <w:p>
       <w:pPr>
-        <w:pStyle w:val="Heading2"/>
-      </w:pPr>
-      <w:r>
-        <w:t>4.3 Controls and Standardization</w:t>
+        <w:pStyle w:val="ListBullet"/>
+      </w:pPr>
+      <w:r>
+        <w:t>Example: ΔForward P/E = peforw_qavg(t+1) − peforw_qavg(t)</w:t>
       </w:r>
     </w:p>
     <w:p>
-      <w:pPr>
-        <w:pStyle w:val="ListBullet"/>
-      </w:pPr>
-      <w:r>
-        <w:t>Document length controls: token count / character count; all intensity measures normalized by length.</w:t>
+      <w:r>
+        <w:t>Target B (Classification): Valuation upgrade indicator</w:t>
       </w:r>
     </w:p>
     <w:p>
@@ -286,31 +659,60 @@
         <w:pStyle w:val="ListBullet"/>
       </w:pPr>
       <w:r>
-        <w:t>Lagged fundamentals: prior-quarter forward P/E, trailing EPS proxies, etc.</w:t>
+        <w:t>Example: 1 if ΔForward P/E is in the top 25% within the same sector and quarter; else 0</w:t>
       </w:r>
     </w:p>
     <w:p>
       <w:pPr>
-        <w:pStyle w:val="ListBullet"/>
-      </w:pPr>
-      <w:r>
-        <w:t>Fixed effects (if feasible): sector and quarter (or year-quarter) indicators; optionally firm fixed effects.</w:t>
+        <w:pStyle w:val="Heading2"/>
+      </w:pPr>
+      <w:r>
+        <w:t>4.2 AI Narrative Features (Main Explanatory Variables)</w:t>
       </w:r>
     </w:p>
     <w:p>
-      <w:pPr>
-        <w:pStyle w:val="Heading1"/>
-      </w:pPr>
-      <w:r>
-        <w:t>5. Methodology (Text Mining + Prediction)</w:t>
+      <w:r>
+        <w:t>We define an AI Narrative Index (ANI) as a multi-component measure to avoid relying on keywords only:</w:t>
       </w:r>
     </w:p>
     <w:p>
       <w:pPr>
-        <w:pStyle w:val="Heading2"/>
-      </w:pPr>
-      <w:r>
-        <w:t>5.1 Descriptive Analysis and Visualization</w:t>
+        <w:pStyle w:val="ListBullet"/>
+      </w:pPr>
+      <w:r>
+        <w:t>Dictionary/keyword intensity: frequency of AI</w:t>
+      </w:r>
+      <w:r>
+        <w:t xml:space="preserve">, </w:t>
+      </w:r>
+      <w:r>
+        <w:t>LLM</w:t>
+      </w:r>
+      <w:r>
+        <w:t xml:space="preserve">, </w:t>
+      </w:r>
+      <w:r>
+        <w:t>GenAI</w:t>
+      </w:r>
+      <w:r>
+        <w:t xml:space="preserve">, etc. </w:t>
+      </w:r>
+      <w:r>
+        <w:t xml:space="preserve"> terms, </w:t>
+      </w:r>
+      <w:proofErr w:type="spellStart"/>
+      <w:r>
+        <w:t>normali</w:t>
+      </w:r>
+      <w:r>
+        <w:t>s</w:t>
+      </w:r>
+      <w:r>
+        <w:t>ed</w:t>
+      </w:r>
+      <w:proofErr w:type="spellEnd"/>
+      <w:r>
+        <w:t xml:space="preserve"> by document length.</w:t>
       </w:r>
     </w:p>
     <w:p>
@@ -318,7 +720,7 @@
         <w:pStyle w:val="ListBullet"/>
       </w:pPr>
       <w:r>
-        <w:t>Coverage checks: number of transcripts by year/quarter and by sector; missingness patterns.</w:t>
+        <w:t>Topic-based AI share: topic modeling (LDA or BERTopic) to estimate the proportion of AI-related topics in each transcript.</w:t>
       </w:r>
     </w:p>
     <w:p>
@@ -326,19 +728,109 @@
         <w:pStyle w:val="ListBullet"/>
       </w:pPr>
       <w:r>
-        <w:t>Trends: ANI over time (overall and by sector/industry).</w:t>
+        <w:t>Semantic similarity: embeddings-based similarity to a small set of AI seed phrases (captures AI discussion even without explicit keywords).</w:t>
       </w:r>
     </w:p>
     <w:p>
       <w:pPr>
-        <w:pStyle w:val="ListBullet"/>
-      </w:pPr>
-      <w:r>
-        <w:t>Heatmaps: sector × time intensity; top companies by ANI growth.</w:t>
+        <w:pStyle w:val="Heading2"/>
+      </w:pPr>
+      <w:r>
+        <w:t>4.3 Controls and Standardization</w:t>
       </w:r>
     </w:p>
     <w:p>
       <w:pPr>
+        <w:pStyle w:val="ListBullet"/>
+      </w:pPr>
+      <w:r>
+        <w:t xml:space="preserve">Document length controls: token count / character count; all intensity measures </w:t>
+      </w:r>
+      <w:proofErr w:type="spellStart"/>
+      <w:r>
+        <w:t>normali</w:t>
+      </w:r>
+      <w:r>
+        <w:t>se</w:t>
+      </w:r>
+      <w:r>
+        <w:t>d</w:t>
+      </w:r>
+      <w:proofErr w:type="spellEnd"/>
+      <w:r>
+        <w:t xml:space="preserve"> by length.</w:t>
+      </w:r>
+    </w:p>
+    <w:p>
+      <w:pPr>
+        <w:pStyle w:val="ListBullet"/>
+      </w:pPr>
+      <w:r>
+        <w:t>Lagged fundamentals: prior-quarter forward P/E, trailing EPS proxies, etc.</w:t>
+      </w:r>
+    </w:p>
+    <w:p>
+      <w:pPr>
+        <w:pStyle w:val="ListBullet"/>
+      </w:pPr>
+      <w:r>
+        <w:t>Fixed effects (if feasible): sector and quarter (or year-quarter) indicators; optionally firm fixed effects.</w:t>
+      </w:r>
+    </w:p>
+    <w:p>
+      <w:pPr>
+        <w:pStyle w:val="Heading1"/>
+      </w:pPr>
+      <w:r>
+        <w:t>5. Methodology (Text Mining + Prediction)</w:t>
+      </w:r>
+    </w:p>
+    <w:p>
+      <w:pPr>
+        <w:pStyle w:val="Heading2"/>
+      </w:pPr>
+      <w:r>
+        <w:t>5.1 Descriptive Analysis and Visualization</w:t>
+      </w:r>
+    </w:p>
+    <w:p>
+      <w:pPr>
+        <w:pStyle w:val="ListBullet"/>
+      </w:pPr>
+      <w:r>
+        <w:t>Coverage checks: number of transcripts by year</w:t>
+      </w:r>
+      <w:r>
+        <w:t xml:space="preserve"> or </w:t>
+      </w:r>
+      <w:r>
+        <w:t>quarter</w:t>
+      </w:r>
+      <w:r>
+        <w:t>,</w:t>
+      </w:r>
+      <w:r>
+        <w:t xml:space="preserve"> and by sector; missingness patterns.</w:t>
+      </w:r>
+    </w:p>
+    <w:p>
+      <w:pPr>
+        <w:pStyle w:val="ListBullet"/>
+      </w:pPr>
+      <w:r>
+        <w:t>Trends: ANI over time (overall and by sector/industry).</w:t>
+      </w:r>
+    </w:p>
+    <w:p>
+      <w:pPr>
+        <w:pStyle w:val="ListBullet"/>
+      </w:pPr>
+      <w:r>
+        <w:t>Heatmaps: sector × time intensity; top companies by ANI growth.</w:t>
+      </w:r>
+    </w:p>
+    <w:p>
+      <w:pPr>
         <w:pStyle w:val="Heading2"/>
       </w:pPr>
       <w:r>
@@ -374,7 +866,13 @@
     </w:p>
     <w:p>
       <w:r>
-        <w:t>Compute sentiment and uncertainty indicators (e.g., Loughran-McDonald style measures) and test how AI narratives co-move with uncertainty. This helps distinguish “hype” vs “credible execution” narratives.</w:t>
+        <w:t xml:space="preserve">Compute sentiment and uncertainty indicators (e.g., Loughran-McDonald style measures) and test how AI narratives </w:t>
+      </w:r>
+      <w:r>
+        <w:t>co-move</w:t>
+      </w:r>
+      <w:r>
+        <w:t xml:space="preserve"> with uncertainty. This helps distinguish “hype” vs “credible execution” narratives.</w:t>
       </w:r>
     </w:p>
     <w:p>
@@ -416,7 +914,39 @@
         <w:pStyle w:val="ListBullet"/>
       </w:pPr>
       <w:r>
-        <w:t>M1: Regularized linear model (LASSO / Elastic Net) using TF-IDF + ANI + sentiment/uncertainty + controls.</w:t>
+        <w:t xml:space="preserve">M1: </w:t>
+      </w:r>
+      <w:proofErr w:type="spellStart"/>
+      <w:r>
+        <w:t>Regulari</w:t>
+      </w:r>
+      <w:r>
+        <w:t>s</w:t>
+      </w:r>
+      <w:r>
+        <w:t>ed</w:t>
+      </w:r>
+      <w:proofErr w:type="spellEnd"/>
+      <w:r>
+        <w:t xml:space="preserve"> linear model </w:t>
+      </w:r>
+      <w:r>
+        <w:t xml:space="preserve">such as </w:t>
+      </w:r>
+      <w:r>
+        <w:t xml:space="preserve">LASSO </w:t>
+      </w:r>
+      <w:r>
+        <w:t>and</w:t>
+      </w:r>
+      <w:r>
+        <w:t xml:space="preserve"> Elastic Net</w:t>
+      </w:r>
+      <w:r>
+        <w:t>,</w:t>
+      </w:r>
+      <w:r>
+        <w:t xml:space="preserve"> using TF-IDF + ANI + sentiment/uncertainty + controls.</w:t>
       </w:r>
     </w:p>
     <w:p>
@@ -424,7 +954,13 @@
         <w:pStyle w:val="ListBullet"/>
       </w:pPr>
       <w:r>
-        <w:t>M2: Nonlinear model (e.g., Gradient Boosting / Random Forest) for robustness and feature-importance interpretation.</w:t>
+        <w:t>M2: Nonlinear model (e.g., Gradient Boosting / Random Forest) for feature</w:t>
+      </w:r>
+      <w:r>
+        <w:t xml:space="preserve"> </w:t>
+      </w:r>
+      <w:r>
+        <w:t>importance interpretation.</w:t>
       </w:r>
     </w:p>
     <w:p>
@@ -437,7 +973,19 @@
         <w:pStyle w:val="ListBullet"/>
       </w:pPr>
       <w:r>
-        <w:t>Time-based split (train early years, test later years) or rolling-window validation to avoid leakage.</w:t>
+        <w:t xml:space="preserve">Time-based split (train early years, test later years) or rolling-window validation to avoid </w:t>
+      </w:r>
+      <w:r>
+        <w:t xml:space="preserve">data </w:t>
+      </w:r>
+      <w:r>
+        <w:t>leakage</w:t>
+      </w:r>
+      <w:r>
+        <w:t xml:space="preserve"> problem</w:t>
+      </w:r>
+      <w:r>
+        <w:t>.</w:t>
       </w:r>
     </w:p>
     <w:p>
@@ -484,10 +1032,6 @@
         <w:t>visuali</w:t>
       </w:r>
       <w:r>
-        <w:rPr>
-          <w:rFonts w:hint="eastAsia"/>
-          <w:lang w:eastAsia="zh-CN"/>
-        </w:rPr>
         <w:t>s</w:t>
       </w:r>
       <w:r>
@@ -519,17 +1063,7 @@
         <w:pStyle w:val="ListBullet"/>
       </w:pPr>
       <w:r>
-        <w:t xml:space="preserve">Causality: the analysis is primarily correlational/predictive; strong causal claims are out of scope without </w:t>
-      </w:r>
-      <w:r>
-        <w:rPr>
-          <w:rFonts w:hint="eastAsia"/>
-          <w:lang w:eastAsia="zh-CN"/>
-        </w:rPr>
-        <w:t xml:space="preserve">an </w:t>
-      </w:r>
-      <w:r>
-        <w:t>additional identification strategy.</w:t>
+        <w:t>Causality: the analysis is primarily correlational/predictive; strong causal claims are out of scope without additional identification strategy.</w:t>
       </w:r>
     </w:p>
     <w:p>
@@ -537,6 +1071,7 @@
         <w:pStyle w:val="ListBullet"/>
       </w:pPr>
       <w:r>
+        <w:lastRenderedPageBreak/>
         <w:t xml:space="preserve">Sample: S&amp;P 500 firms are large and mature; results may not </w:t>
       </w:r>
       <w:proofErr w:type="spellStart"/>
@@ -544,10 +1079,6 @@
         <w:t>generali</w:t>
       </w:r>
       <w:r>
-        <w:rPr>
-          <w:rFonts w:hint="eastAsia"/>
-          <w:lang w:eastAsia="zh-CN"/>
-        </w:rPr>
         <w:t>s</w:t>
       </w:r>
       <w:r>
@@ -555,7 +1086,13 @@
       </w:r>
       <w:proofErr w:type="spellEnd"/>
       <w:r>
-        <w:t xml:space="preserve"> to small-cap firms.</w:t>
+        <w:t xml:space="preserve"> to </w:t>
+      </w:r>
+      <w:r>
+        <w:t xml:space="preserve">other </w:t>
+      </w:r>
+      <w:r>
+        <w:t>small-cap firms.</w:t>
       </w:r>
     </w:p>
     <w:p>
@@ -563,8 +1100,13 @@
         <w:pStyle w:val="ListBullet"/>
       </w:pPr>
       <w:r>
-        <w:lastRenderedPageBreak/>
-        <w:t>Measurement error: “AI” discussion may be implicit; we mitigate this via a combination of keyword, topic, and semantic features.</w:t>
+        <w:t>Measurement error: AI discussion may be implicit</w:t>
+      </w:r>
+      <w:r>
+        <w:t xml:space="preserve"> and hard to be identified</w:t>
+      </w:r>
+      <w:r>
+        <w:t>; we mitigate this via a combination of keyword, topic, and semantic features.</w:t>
       </w:r>
     </w:p>
     <w:p>
@@ -572,17 +1114,24 @@
         <w:pStyle w:val="ListBullet"/>
       </w:pPr>
       <w:r>
-        <w:t>Text heterogeneity: transcript length and speaker composition vary; we control/standardi</w:t>
-      </w:r>
-      <w:r>
-        <w:rPr>
-          <w:rFonts w:hint="eastAsia"/>
-          <w:lang w:eastAsia="zh-CN"/>
-        </w:rPr>
+        <w:t xml:space="preserve">Text heterogeneity: transcript length and speaker composition vary; we </w:t>
+      </w:r>
+      <w:proofErr w:type="spellStart"/>
+      <w:r>
         <w:t>s</w:t>
       </w:r>
       <w:r>
-        <w:t>e and use robustness checks.</w:t>
+        <w:t>tandardi</w:t>
+      </w:r>
+      <w:r>
+        <w:t>s</w:t>
+      </w:r>
+      <w:r>
+        <w:t>e</w:t>
+      </w:r>
+      <w:proofErr w:type="spellEnd"/>
+      <w:r>
+        <w:t xml:space="preserve"> and use robustness checks.</w:t>
       </w:r>
     </w:p>
     <w:p>
@@ -612,13 +1161,25 @@
     <w:p>
       <w:pPr>
         <w:pStyle w:val="ListBullet"/>
-        <w:rPr>
-          <w:rFonts w:hint="eastAsia"/>
-        </w:rPr>
-      </w:pPr>
-      <w:r>
-        <w:t>Code: reproducible pipeline (data cleaning, feature engineering, modeling, evaluation) with clear documentation.</w:t>
-      </w:r>
+      </w:pPr>
+      <w:r>
+        <w:t xml:space="preserve">Code: reproducible pipeline (data cleaning, feature engineering, modeling, evaluation) with clear </w:t>
+      </w:r>
+      <w:r>
+        <w:t xml:space="preserve">supporting </w:t>
+      </w:r>
+      <w:r>
+        <w:t>documentation.</w:t>
+      </w:r>
+    </w:p>
+    <w:p>
+      <w:pPr>
+        <w:pStyle w:val="ListBullet"/>
+        <w:numPr>
+          <w:ilvl w:val="0"/>
+          <w:numId w:val="0"/>
+        </w:numPr>
+      </w:pPr>
     </w:p>
     <w:p>
       <w:r>
@@ -628,7 +1189,19 @@
         <w:t xml:space="preserve">Notes: </w:t>
       </w:r>
       <w:r>
-        <w:t>This is a working draft. We can adjust targets (forward P/E vs forward EPS) depending on data completeness and interpretability.</w:t>
+        <w:t>This is a</w:t>
+      </w:r>
+      <w:r>
+        <w:t xml:space="preserve"> proposal. </w:t>
+      </w:r>
+      <w:r>
+        <w:t xml:space="preserve">We </w:t>
+      </w:r>
+      <w:r>
+        <w:t>may</w:t>
+      </w:r>
+      <w:r>
+        <w:t xml:space="preserve"> adjust targets (forward P/E vs forward EPS) depending on data completeness and interpretability.</w:t>
       </w:r>
     </w:p>
     <w:sectPr>
@@ -842,6 +1415,14 @@
     <w:abstractNumId w:val="0"/>
   </w:num>
 </w:numbering>
+</file>
+
+<file path=word/people.xml><?xml version="1.0" encoding="utf-8"?>
+<w15:people xmlns:w15="http://schemas.microsoft.com/office/word/2012/wordml">
+  <w15:person w15:author="Claude">
+    <w15:presenceInfo w15:providerId="None" w15:userId="Claude"/>
+  </w15:person>
+</w15:people>
 </file>
 
 <file path=word/styles.xml><?xml version="1.0" encoding="utf-8"?>

</xml_diff>